<commit_message>
Correcciones: pares .h/.cpp completos, UML como imagen y Word con estilo
- Config, Azar y Entrada ahora tienen .h Y .cpp (antes solo .h). Se
  movio la implementacion al .cpp y se agregaron metodos auxiliares.
  Anadidos al vcxproj y a los filtros. Todos los .h tienen su .cpp.
- UML_Diagrama.png rediseñado: compacto y bien conectado (estilo del
  diagrama de referencia), herencia con triangulo y composicion con
  rombo hacia la clase controladora Juego.
- Bitacora_IA.docx y Plan_de_Actividades.docx rehechos con el estilo
  del Word de referencia (Arial 11, nombres completos del equipo,
  tabla con CUMPLIDO). Bitacora reducida a 6 actividades. Plan con las
  responsabilidades correctas (Gustavo: Nivel 1; Bryan: instrucciones;
  Lenin: creditos; Biary: plan; Mustafa: UML).
- PC1_FUENTE.TXT regenerado con los 42 archivos.

https://claude.ai/code/session_01UmirVF5HKyNN8gFhDMPJYf
</commit_message>
<xml_diff>
--- a/PoliNavis/Entregables/Bitacora_IA.docx
+++ b/PoliNavis/Entregables/Bitacora_IA.docx
@@ -4,10 +4,58 @@
   <w:body>
     <w:p>
       <w:pPr>
-        <w:pStyle w:val="Title"/>
+        <w:jc w:val="center"/>
       </w:pPr>
       <w:r>
-        <w:t>Bitácora de Uso de IA — Anexo 1</w:t>
+        <w:rPr>
+          <w:rFonts w:ascii="Arial" w:hAnsi="Arial"/>
+          <w:b/>
+          <w:sz w:val="30"/>
+        </w:rPr>
+        <w:t>PRACTICA CALIFICADA 1 (PC1) - GAME JAM</w:t>
+      </w:r>
+    </w:p>
+    <w:p>
+      <w:pPr>
+        <w:jc w:val="center"/>
+      </w:pPr>
+      <w:r>
+        <w:rPr>
+          <w:b/>
+          <w:sz w:val="24"/>
+        </w:rPr>
+        <w:t>Bitacora de Uso de IA (Anexo 1)</w:t>
+      </w:r>
+    </w:p>
+    <w:p/>
+    <w:p>
+      <w:r>
+        <w:rPr>
+          <w:b/>
+          <w:sz w:val="22"/>
+        </w:rPr>
+        <w:t xml:space="preserve">Curso: </w:t>
+      </w:r>
+      <w:r>
+        <w:rPr>
+          <w:sz w:val="22"/>
+        </w:rPr>
+        <w:t>Algoritmos de Programacion (1ACC0265)</w:t>
+      </w:r>
+    </w:p>
+    <w:p>
+      <w:r>
+        <w:rPr>
+          <w:b/>
+          <w:sz w:val="22"/>
+        </w:rPr>
+        <w:t xml:space="preserve">Proyecto: </w:t>
+      </w:r>
+      <w:r>
+        <w:rPr>
+          <w:sz w:val="22"/>
+        </w:rPr>
+        <w:t>PoliNavis: Viaje Interestelar</w:t>
       </w:r>
     </w:p>
     <w:p>
@@ -15,61 +63,101 @@
         <w:rPr>
           <w:b/>
         </w:rPr>
-        <w:t>PC1: Game Jam — "PoliNavis: Viaje Interestelar"</w:t>
-      </w:r>
-    </w:p>
-    <w:p>
-      <w:r>
-        <w:t>Curso: Algoritmos de Programación (1ACC0265)</w:t>
-      </w:r>
-    </w:p>
-    <w:p>
-      <w:r>
-        <w:t>Equipo: Bryan Cordova · Lenin Palomino · Gustavo Arimana · Mustafa Altuntas · Biary Tineo</w:t>
-      </w:r>
-    </w:p>
-    <w:p>
-      <w:r>
-        <w:t>Herramienta de IA utilizada: Claude (asistente de programación).</w:t>
-      </w:r>
-    </w:p>
-    <w:p>
-      <w:r>
-        <w:rPr>
-          <w:i/>
-        </w:rPr>
-        <w:t>Esta bitácora documenta cómo y para qué usamos la IA, qué prompts dimos, qué resultó y cómo verificamos/modificamos cada respuesta. Cada integrante puede sustentar oralmente los registros que le corresponden.</w:t>
+        <w:t>Integrantes:</w:t>
       </w:r>
     </w:p>
     <w:p>
       <w:pPr>
-        <w:pStyle w:val="Heading1"/>
+        <w:pStyle w:val="ListBullet"/>
       </w:pPr>
       <w:r>
-        <w:t>1. Resumen por actividad</w:t>
+        <w:t>Mustafa Altuntas</w:t>
       </w:r>
     </w:p>
+    <w:p>
+      <w:pPr>
+        <w:pStyle w:val="ListBullet"/>
+      </w:pPr>
+      <w:r>
+        <w:t>Manuel Gustavo Arimana Huachuhillca</w:t>
+      </w:r>
+    </w:p>
+    <w:p>
+      <w:pPr>
+        <w:pStyle w:val="ListBullet"/>
+      </w:pPr>
+      <w:r>
+        <w:t>Bryan Sebastian Cordova Alfaro</w:t>
+      </w:r>
+    </w:p>
+    <w:p>
+      <w:pPr>
+        <w:pStyle w:val="ListBullet"/>
+      </w:pPr>
+      <w:r>
+        <w:t>Lenin Gabriel Palomino Diaz</w:t>
+      </w:r>
+    </w:p>
+    <w:p>
+      <w:pPr>
+        <w:pStyle w:val="ListBullet"/>
+      </w:pPr>
+      <w:r>
+        <w:t>Biary Edver Tineo Palacios</w:t>
+      </w:r>
+    </w:p>
+    <w:p/>
+    <w:p>
+      <w:r>
+        <w:rPr>
+          <w:b/>
+        </w:rPr>
+        <w:t xml:space="preserve">Herramienta de IA utilizada: </w:t>
+      </w:r>
+      <w:r>
+        <w:t>Claude (asistente de programacion). A continuacion se registra para que se uso, que se le pidio y como el equipo verifico y modifico cada resultado.</w:t>
+      </w:r>
+    </w:p>
+    <w:p/>
     <w:tbl>
       <w:tblPr>
         <w:tblStyle w:val="TableGrid"/>
         <w:tblW w:type="auto" w:w="0"/>
-        <w:jc w:val="center"/>
         <w:tblLook w:firstColumn="1" w:firstRow="1" w:lastColumn="0" w:lastRow="0" w:noHBand="0" w:noVBand="1" w:val="04A0"/>
       </w:tblPr>
       <w:tblGrid>
-        <w:gridCol w:w="1502"/>
-        <w:gridCol w:w="1502"/>
-        <w:gridCol w:w="1502"/>
-        <w:gridCol w:w="1502"/>
-        <w:gridCol w:w="1502"/>
-        <w:gridCol w:w="1502"/>
-        <w:gridCol w:w="1502"/>
+        <w:gridCol w:w="2045"/>
+        <w:gridCol w:w="2045"/>
+        <w:gridCol w:w="2045"/>
+        <w:gridCol w:w="2045"/>
+        <w:gridCol w:w="2045"/>
       </w:tblGrid>
       <w:tr>
         <w:tc>
           <w:tcPr>
             <w:tcW w:type="dxa" w:w="576"/>
-            <w:shd w:val="clear" w:fill="1F3864"/>
+            <w:shd w:val="clear" w:fill="1F4E79"/>
+          </w:tcPr>
+          <w:p>
+            <w:pPr>
+              <w:jc w:val="center"/>
+            </w:pPr>
+            <w:r/>
+            <w:r>
+              <w:rPr>
+                <w:rFonts w:ascii="Arial" w:hAnsi="Arial"/>
+                <w:b/>
+                <w:color w:val="FFFFFF"/>
+                <w:sz w:val="20"/>
+              </w:rPr>
+              <w:t>N°</w:t>
+            </w:r>
+          </w:p>
+        </w:tc>
+        <w:tc>
+          <w:tcPr>
+            <w:tcW w:type="dxa" w:w="2448"/>
+            <w:shd w:val="clear" w:fill="1F4E79"/>
           </w:tcPr>
           <w:p>
             <w:pPr>
@@ -78,18 +166,19 @@
             <w:r/>
             <w:r>
               <w:rPr>
+                <w:rFonts w:ascii="Arial" w:hAnsi="Arial"/>
                 <w:b/>
                 <w:color w:val="FFFFFF"/>
-                <w:sz w:val="17"/>
+                <w:sz w:val="20"/>
               </w:rPr>
-              <w:t>N°</w:t>
+              <w:t>Actividad / Proposito</w:t>
             </w:r>
           </w:p>
         </w:tc>
         <w:tc>
           <w:tcPr>
-            <w:tcW w:type="dxa" w:w="864"/>
-            <w:shd w:val="clear" w:fill="1F3864"/>
+            <w:tcW w:type="dxa" w:w="3744"/>
+            <w:shd w:val="clear" w:fill="1F4E79"/>
           </w:tcPr>
           <w:p>
             <w:pPr>
@@ -98,18 +187,19 @@
             <w:r/>
             <w:r>
               <w:rPr>
+                <w:rFonts w:ascii="Arial" w:hAnsi="Arial"/>
                 <w:b/>
                 <w:color w:val="FFFFFF"/>
-                <w:sz w:val="17"/>
+                <w:sz w:val="20"/>
               </w:rPr>
-              <w:t>Fecha</w:t>
+              <w:t>Prompt utilizado (resumen)</w:t>
             </w:r>
           </w:p>
         </w:tc>
         <w:tc>
           <w:tcPr>
-            <w:tcW w:type="dxa" w:w="1296"/>
-            <w:shd w:val="clear" w:fill="1F3864"/>
+            <w:tcW w:type="dxa" w:w="2880"/>
+            <w:shd w:val="clear" w:fill="1F4E79"/>
           </w:tcPr>
           <w:p>
             <w:pPr>
@@ -118,18 +208,19 @@
             <w:r/>
             <w:r>
               <w:rPr>
+                <w:rFonts w:ascii="Arial" w:hAnsi="Arial"/>
                 <w:b/>
                 <w:color w:val="FFFFFF"/>
-                <w:sz w:val="17"/>
+                <w:sz w:val="20"/>
               </w:rPr>
-              <w:t>Integrante</w:t>
+              <w:t>Resultado obtenido</w:t>
             </w:r>
           </w:p>
         </w:tc>
         <w:tc>
           <w:tcPr>
-            <w:tcW w:type="dxa" w:w="2448"/>
-            <w:shd w:val="clear" w:fill="1F3864"/>
+            <w:tcW w:type="dxa" w:w="2880"/>
+            <w:shd w:val="clear" w:fill="1F4E79"/>
           </w:tcPr>
           <w:p>
             <w:pPr>
@@ -138,71 +229,12 @@
             <w:r/>
             <w:r>
               <w:rPr>
+                <w:rFonts w:ascii="Arial" w:hAnsi="Arial"/>
                 <w:b/>
                 <w:color w:val="FFFFFF"/>
-                <w:sz w:val="17"/>
+                <w:sz w:val="20"/>
               </w:rPr>
-              <w:t>Propósito / Actividad</w:t>
-            </w:r>
-          </w:p>
-        </w:tc>
-        <w:tc>
-          <w:tcPr>
-            <w:tcW w:type="dxa" w:w="1152"/>
-            <w:shd w:val="clear" w:fill="1F3864"/>
-          </w:tcPr>
-          <w:p>
-            <w:pPr>
-              <w:jc w:val="left"/>
-            </w:pPr>
-            <w:r/>
-            <w:r>
-              <w:rPr>
-                <w:b/>
-                <w:color w:val="FFFFFF"/>
-                <w:sz w:val="17"/>
-              </w:rPr>
-              <w:t>Herramienta</w:t>
-            </w:r>
-          </w:p>
-        </w:tc>
-        <w:tc>
-          <w:tcPr>
-            <w:tcW w:type="dxa" w:w="2736"/>
-            <w:shd w:val="clear" w:fill="1F3864"/>
-          </w:tcPr>
-          <w:p>
-            <w:pPr>
-              <w:jc w:val="left"/>
-            </w:pPr>
-            <w:r/>
-            <w:r>
-              <w:rPr>
-                <w:b/>
-                <w:color w:val="FFFFFF"/>
-                <w:sz w:val="17"/>
-              </w:rPr>
-              <w:t>Resultado</w:t>
-            </w:r>
-          </w:p>
-        </w:tc>
-        <w:tc>
-          <w:tcPr>
-            <w:tcW w:type="dxa" w:w="2880"/>
-            <w:shd w:val="clear" w:fill="1F3864"/>
-          </w:tcPr>
-          <w:p>
-            <w:pPr>
-              <w:jc w:val="left"/>
-            </w:pPr>
-            <w:r/>
-            <w:r>
-              <w:rPr>
-                <w:b/>
-                <w:color w:val="FFFFFF"/>
-                <w:sz w:val="17"/>
-              </w:rPr>
-              <w:t>Validación / Modificación</w:t>
+              <w:t>Como lo validamos</w:t>
             </w:r>
           </w:p>
         </w:tc>
@@ -214,51 +246,16 @@
           </w:tcPr>
           <w:p>
             <w:pPr>
-              <w:jc w:val="left"/>
+              <w:jc w:val="center"/>
             </w:pPr>
             <w:r/>
             <w:r>
               <w:rPr>
+                <w:rFonts w:ascii="Arial" w:hAnsi="Arial"/>
                 <w:b w:val="0"/>
-                <w:sz w:val="16"/>
+                <w:sz w:val="18"/>
               </w:rPr>
               <w:t>1</w:t>
-            </w:r>
-          </w:p>
-        </w:tc>
-        <w:tc>
-          <w:tcPr>
-            <w:tcW w:type="dxa" w:w="864"/>
-          </w:tcPr>
-          <w:p>
-            <w:pPr>
-              <w:jc w:val="left"/>
-            </w:pPr>
-            <w:r/>
-            <w:r>
-              <w:rPr>
-                <w:b w:val="0"/>
-                <w:sz w:val="16"/>
-              </w:rPr>
-              <w:t>13/06</w:t>
-            </w:r>
-          </w:p>
-        </w:tc>
-        <w:tc>
-          <w:tcPr>
-            <w:tcW w:type="dxa" w:w="1296"/>
-          </w:tcPr>
-          <w:p>
-            <w:pPr>
-              <w:jc w:val="left"/>
-            </w:pPr>
-            <w:r/>
-            <w:r>
-              <w:rPr>
-                <w:b w:val="0"/>
-                <w:sz w:val="16"/>
-              </w:rPr>
-              <w:t>Lenin</w:t>
             </w:r>
           </w:p>
         </w:tc>
@@ -273,16 +270,17 @@
             <w:r/>
             <w:r>
               <w:rPr>
+                <w:rFonts w:ascii="Arial" w:hAnsi="Arial"/>
                 <w:b w:val="0"/>
-                <w:sz w:val="16"/>
+                <w:sz w:val="18"/>
               </w:rPr>
-              <w:t>Diseñar la jerarquía de clases (POO) desde la rúbrica</w:t>
+              <w:t>Diseñar la jerarquia de clases (POO)</w:t>
             </w:r>
           </w:p>
         </w:tc>
         <w:tc>
           <w:tcPr>
-            <w:tcW w:type="dxa" w:w="1152"/>
+            <w:tcW w:type="dxa" w:w="3744"/>
           </w:tcPr>
           <w:p>
             <w:pPr>
@@ -291,28 +289,11 @@
             <w:r/>
             <w:r>
               <w:rPr>
+                <w:rFonts w:ascii="Arial" w:hAnsi="Arial"/>
                 <w:b w:val="0"/>
-                <w:sz w:val="16"/>
+                <w:sz w:val="18"/>
               </w:rPr>
-              <w:t>Claude</w:t>
-            </w:r>
-          </w:p>
-        </w:tc>
-        <w:tc>
-          <w:tcPr>
-            <w:tcW w:type="dxa" w:w="2736"/>
-          </w:tcPr>
-          <w:p>
-            <w:pPr>
-              <w:jc w:val="left"/>
-            </w:pPr>
-            <w:r/>
-            <w:r>
-              <w:rPr>
-                <w:b w:val="0"/>
-                <w:sz w:val="16"/>
-              </w:rPr>
-              <w:t>Clase base abstracta Entidad + herencias</w:t>
+              <w:t>"Propon una jerarquia con una clase base abstracta y herencia para un juego donde la nave va del Punto A al Punto B esquivando."</w:t>
             </w:r>
           </w:p>
         </w:tc>
@@ -327,10 +308,30 @@
             <w:r/>
             <w:r>
               <w:rPr>
+                <w:rFonts w:ascii="Arial" w:hAnsi="Arial"/>
                 <w:b w:val="0"/>
-                <w:sz w:val="16"/>
+                <w:sz w:val="18"/>
               </w:rPr>
-              <w:t>Revisamos que cubriera abstracción, herencia y polimorfismo; nombres al español</w:t>
+              <w:t>Clase base Entidad (abstracta) y de ella Nave, Sol, Planeta, Obstaculo y Estacion.</w:t>
+            </w:r>
+          </w:p>
+        </w:tc>
+        <w:tc>
+          <w:tcPr>
+            <w:tcW w:type="dxa" w:w="2880"/>
+          </w:tcPr>
+          <w:p>
+            <w:pPr>
+              <w:jc w:val="left"/>
+            </w:pPr>
+            <w:r/>
+            <w:r>
+              <w:rPr>
+                <w:rFonts w:ascii="Arial" w:hAnsi="Arial"/>
+                <w:b w:val="0"/>
+                <w:sz w:val="18"/>
+              </w:rPr>
+              <w:t>Revisamos que aplicara abstraccion, herencia y polimorfismo; tradujimos los nombres al español.</w:t>
             </w:r>
           </w:p>
         </w:tc>
@@ -342,51 +343,16 @@
           </w:tcPr>
           <w:p>
             <w:pPr>
-              <w:jc w:val="left"/>
+              <w:jc w:val="center"/>
             </w:pPr>
             <w:r/>
             <w:r>
               <w:rPr>
+                <w:rFonts w:ascii="Arial" w:hAnsi="Arial"/>
                 <w:b w:val="0"/>
-                <w:sz w:val="16"/>
+                <w:sz w:val="18"/>
               </w:rPr>
               <w:t>2</w:t>
-            </w:r>
-          </w:p>
-        </w:tc>
-        <w:tc>
-          <w:tcPr>
-            <w:tcW w:type="dxa" w:w="864"/>
-          </w:tcPr>
-          <w:p>
-            <w:pPr>
-              <w:jc w:val="left"/>
-            </w:pPr>
-            <w:r/>
-            <w:r>
-              <w:rPr>
-                <w:b w:val="0"/>
-                <w:sz w:val="16"/>
-              </w:rPr>
-              <w:t>13/06</w:t>
-            </w:r>
-          </w:p>
-        </w:tc>
-        <w:tc>
-          <w:tcPr>
-            <w:tcW w:type="dxa" w:w="1296"/>
-          </w:tcPr>
-          <w:p>
-            <w:pPr>
-              <w:jc w:val="left"/>
-            </w:pPr>
-            <w:r/>
-            <w:r>
-              <w:rPr>
-                <w:b w:val="0"/>
-                <w:sz w:val="16"/>
-              </w:rPr>
-              <w:t>Bryan</w:t>
             </w:r>
           </w:p>
         </w:tc>
@@ -401,16 +367,17 @@
             <w:r/>
             <w:r>
               <w:rPr>
+                <w:rFonts w:ascii="Arial" w:hAnsi="Arial"/>
                 <w:b w:val="0"/>
-                <w:sz w:val="16"/>
+                <w:sz w:val="18"/>
               </w:rPr>
-              <w:t>Definir la clase controladora Juego</w:t>
+              <w:t>Dibujar la nave y los planetas con figuras</w:t>
             </w:r>
           </w:p>
         </w:tc>
         <w:tc>
           <w:tcPr>
-            <w:tcW w:type="dxa" w:w="1152"/>
+            <w:tcW w:type="dxa" w:w="3744"/>
           </w:tcPr>
           <w:p>
             <w:pPr>
@@ -419,28 +386,11 @@
             <w:r/>
             <w:r>
               <w:rPr>
+                <w:rFonts w:ascii="Arial" w:hAnsi="Arial"/>
                 <w:b w:val="0"/>
-                <w:sz w:val="16"/>
+                <w:sz w:val="18"/>
               </w:rPr>
-              <w:t>Claude</w:t>
-            </w:r>
-          </w:p>
-        </w:tc>
-        <w:tc>
-          <w:tcPr>
-            <w:tcW w:type="dxa" w:w="2736"/>
-          </w:tcPr>
-          <w:p>
-            <w:pPr>
-              <w:jc w:val="left"/>
-            </w:pPr>
-            <w:r/>
-            <w:r>
-              <w:rPr>
-                <w:b w:val="0"/>
-                <w:sz w:val="16"/>
-              </w:rPr>
-              <w:t>Máquina de estados (MENU, NIVEL1, NIVEL2, mensajes)</w:t>
+              <w:t>"¿Como dibujo la nave y los planetas solo con poligonos y lineas, y que la rotacion se vea, sin sprites?"</w:t>
             </w:r>
           </w:p>
         </w:tc>
@@ -455,10 +405,30 @@
             <w:r/>
             <w:r>
               <w:rPr>
+                <w:rFonts w:ascii="Arial" w:hAnsi="Arial"/>
                 <w:b w:val="0"/>
-                <w:sz w:val="16"/>
+                <w:sz w:val="18"/>
               </w:rPr>
-              <w:t>Comprobamos que centraliza Nave, Planetas, Obstáculos y Estación</w:t>
+              <w:t>Nave con poligonos; Planeta con orbita (seno/coseno) y manchas que giran (helper marca()).</w:t>
+            </w:r>
+          </w:p>
+        </w:tc>
+        <w:tc>
+          <w:tcPr>
+            <w:tcW w:type="dxa" w:w="2880"/>
+          </w:tcPr>
+          <w:p>
+            <w:pPr>
+              <w:jc w:val="left"/>
+            </w:pPr>
+            <w:r/>
+            <w:r>
+              <w:rPr>
+                <w:rFonts w:ascii="Arial" w:hAnsi="Arial"/>
+                <w:b w:val="0"/>
+                <w:sz w:val="18"/>
+              </w:rPr>
+              <w:t>Probamos hasta que Tierra y Saturno se vieran distintos y el giro fluido.</w:t>
             </w:r>
           </w:p>
         </w:tc>
@@ -470,51 +440,16 @@
           </w:tcPr>
           <w:p>
             <w:pPr>
-              <w:jc w:val="left"/>
+              <w:jc w:val="center"/>
             </w:pPr>
             <w:r/>
             <w:r>
               <w:rPr>
+                <w:rFonts w:ascii="Arial" w:hAnsi="Arial"/>
                 <w:b w:val="0"/>
-                <w:sz w:val="16"/>
+                <w:sz w:val="18"/>
               </w:rPr>
               <w:t>3</w:t>
-            </w:r>
-          </w:p>
-        </w:tc>
-        <w:tc>
-          <w:tcPr>
-            <w:tcW w:type="dxa" w:w="864"/>
-          </w:tcPr>
-          <w:p>
-            <w:pPr>
-              <w:jc w:val="left"/>
-            </w:pPr>
-            <w:r/>
-            <w:r>
-              <w:rPr>
-                <w:b w:val="0"/>
-                <w:sz w:val="16"/>
-              </w:rPr>
-              <w:t>13/06</w:t>
-            </w:r>
-          </w:p>
-        </w:tc>
-        <w:tc>
-          <w:tcPr>
-            <w:tcW w:type="dxa" w:w="1296"/>
-          </w:tcPr>
-          <w:p>
-            <w:pPr>
-              <w:jc w:val="left"/>
-            </w:pPr>
-            <w:r/>
-            <w:r>
-              <w:rPr>
-                <w:b w:val="0"/>
-                <w:sz w:val="16"/>
-              </w:rPr>
-              <w:t>Gustavo</w:t>
             </w:r>
           </w:p>
         </w:tc>
@@ -529,16 +464,17 @@
             <w:r/>
             <w:r>
               <w:rPr>
+                <w:rFonts w:ascii="Arial" w:hAnsi="Arial"/>
                 <w:b w:val="0"/>
-                <w:sz w:val="16"/>
+                <w:sz w:val="18"/>
               </w:rPr>
-              <w:t>Dibujar la nave solo con polígonos/líneas</w:t>
+              <w:t>Cometas, asteroides y colisiones</w:t>
             </w:r>
           </w:p>
         </w:tc>
         <w:tc>
           <w:tcPr>
-            <w:tcW w:type="dxa" w:w="1152"/>
+            <w:tcW w:type="dxa" w:w="3744"/>
           </w:tcPr>
           <w:p>
             <w:pPr>
@@ -547,28 +483,11 @@
             <w:r/>
             <w:r>
               <w:rPr>
+                <w:rFonts w:ascii="Arial" w:hAnsi="Arial"/>
                 <w:b w:val="0"/>
-                <w:sz w:val="16"/>
+                <w:sz w:val="18"/>
               </w:rPr>
-              <w:t>Claude</w:t>
-            </w:r>
-          </w:p>
-        </w:tc>
-        <w:tc>
-          <w:tcPr>
-            <w:tcW w:type="dxa" w:w="2736"/>
-          </w:tcPr>
-          <w:p>
-            <w:pPr>
-              <w:jc w:val="left"/>
-            </w:pPr>
-            <w:r/>
-            <w:r>
-              <w:rPr>
-                <w:b w:val="0"/>
-                <w:sz w:val="16"/>
-              </w:rPr>
-              <w:t>Nave::dibujar con triángulos, rombo y cabina</w:t>
+              <w:t>"Genera cometas y asteroides con trayectoria y velocidad aleatorias, y la colision que regresa la nave al inicio."</w:t>
             </w:r>
           </w:p>
         </w:tc>
@@ -583,10 +502,30 @@
             <w:r/>
             <w:r>
               <w:rPr>
+                <w:rFonts w:ascii="Arial" w:hAnsi="Arial"/>
                 <w:b w:val="0"/>
-                <w:sz w:val="16"/>
+                <w:sz w:val="18"/>
               </w:rPr>
-              <w:t>Probamos en pantalla; gira hacia su dirección con Atan2</w:t>
+              <w:t>Spawner aleatorio por intervalos + revisarColisiones() que resta vida y reinicia la nave.</w:t>
+            </w:r>
+          </w:p>
+        </w:tc>
+        <w:tc>
+          <w:tcPr>
+            <w:tcW w:type="dxa" w:w="2880"/>
+          </w:tcPr>
+          <w:p>
+            <w:pPr>
+              <w:jc w:val="left"/>
+            </w:pPr>
+            <w:r/>
+            <w:r>
+              <w:rPr>
+                <w:rFonts w:ascii="Arial" w:hAnsi="Arial"/>
+                <w:b w:val="0"/>
+                <w:sz w:val="18"/>
+              </w:rPr>
+              <w:t>Confirmamos que van mas rapido que la nave y que suma colisiones.</w:t>
             </w:r>
           </w:p>
         </w:tc>
@@ -598,51 +537,16 @@
           </w:tcPr>
           <w:p>
             <w:pPr>
-              <w:jc w:val="left"/>
+              <w:jc w:val="center"/>
             </w:pPr>
             <w:r/>
             <w:r>
               <w:rPr>
+                <w:rFonts w:ascii="Arial" w:hAnsi="Arial"/>
                 <w:b w:val="0"/>
-                <w:sz w:val="16"/>
+                <w:sz w:val="18"/>
               </w:rPr>
               <w:t>4</w:t>
-            </w:r>
-          </w:p>
-        </w:tc>
-        <w:tc>
-          <w:tcPr>
-            <w:tcW w:type="dxa" w:w="864"/>
-          </w:tcPr>
-          <w:p>
-            <w:pPr>
-              <w:jc w:val="left"/>
-            </w:pPr>
-            <w:r/>
-            <w:r>
-              <w:rPr>
-                <w:b w:val="0"/>
-                <w:sz w:val="16"/>
-              </w:rPr>
-              <w:t>13/06</w:t>
-            </w:r>
-          </w:p>
-        </w:tc>
-        <w:tc>
-          <w:tcPr>
-            <w:tcW w:type="dxa" w:w="1296"/>
-          </w:tcPr>
-          <w:p>
-            <w:pPr>
-              <w:jc w:val="left"/>
-            </w:pPr>
-            <w:r/>
-            <w:r>
-              <w:rPr>
-                <w:b w:val="0"/>
-                <w:sz w:val="16"/>
-              </w:rPr>
-              <w:t>Lenin</w:t>
             </w:r>
           </w:p>
         </w:tc>
@@ -657,16 +561,17 @@
             <w:r/>
             <w:r>
               <w:rPr>
+                <w:rFonts w:ascii="Arial" w:hAnsi="Arial"/>
                 <w:b w:val="0"/>
-                <w:sz w:val="16"/>
+                <w:sz w:val="18"/>
               </w:rPr>
-              <w:t>Planetas con rotación (eje) y traslación (órbita)</w:t>
+              <w:t>Clase controladora Juego</w:t>
             </w:r>
           </w:p>
         </w:tc>
         <w:tc>
           <w:tcPr>
-            <w:tcW w:type="dxa" w:w="1152"/>
+            <w:tcW w:type="dxa" w:w="3744"/>
           </w:tcPr>
           <w:p>
             <w:pPr>
@@ -675,28 +580,11 @@
             <w:r/>
             <w:r>
               <w:rPr>
+                <w:rFonts w:ascii="Arial" w:hAnsi="Arial"/>
                 <w:b w:val="0"/>
-                <w:sz w:val="16"/>
+                <w:sz w:val="18"/>
               </w:rPr>
-              <w:t>Claude</w:t>
-            </w:r>
-          </w:p>
-        </w:tc>
-        <w:tc>
-          <w:tcPr>
-            <w:tcW w:type="dxa" w:w="2736"/>
-          </w:tcPr>
-          <w:p>
-            <w:pPr>
-              <w:jc w:val="left"/>
-            </w:pPr>
-            <w:r/>
-            <w:r>
-              <w:rPr>
-                <w:b w:val="0"/>
-                <w:sz w:val="16"/>
-              </w:rPr>
-              <w:t>Clase Planeta + 8 subclases</w:t>
+              <w:t>"Crea una clase controladora que integre todas las clases y maneje los niveles y mensajes."</w:t>
             </w:r>
           </w:p>
         </w:tc>
@@ -711,10 +599,30 @@
             <w:r/>
             <w:r>
               <w:rPr>
+                <w:rFonts w:ascii="Arial" w:hAnsi="Arial"/>
                 <w:b w:val="0"/>
-                <w:sz w:val="16"/>
+                <w:sz w:val="18"/>
               </w:rPr>
-              <w:t>Verificamos Tierra y Saturno distintos; añadimos anillos</w:t>
+              <w:t>Clase Juego con maquina de estados (menu, niveles, mensajes) y bucle actualizar/dibujar.</w:t>
+            </w:r>
+          </w:p>
+        </w:tc>
+        <w:tc>
+          <w:tcPr>
+            <w:tcW w:type="dxa" w:w="2880"/>
+          </w:tcPr>
+          <w:p>
+            <w:pPr>
+              <w:jc w:val="left"/>
+            </w:pPr>
+            <w:r/>
+            <w:r>
+              <w:rPr>
+                <w:rFonts w:ascii="Arial" w:hAnsi="Arial"/>
+                <w:b w:val="0"/>
+                <w:sz w:val="18"/>
+              </w:rPr>
+              <w:t>Comprobamos que centraliza Nave, Planetas, Obstaculos y Estacion.</w:t>
             </w:r>
           </w:p>
         </w:tc>
@@ -726,51 +634,16 @@
           </w:tcPr>
           <w:p>
             <w:pPr>
-              <w:jc w:val="left"/>
+              <w:jc w:val="center"/>
             </w:pPr>
             <w:r/>
             <w:r>
               <w:rPr>
+                <w:rFonts w:ascii="Arial" w:hAnsi="Arial"/>
                 <w:b w:val="0"/>
-                <w:sz w:val="16"/>
+                <w:sz w:val="18"/>
               </w:rPr>
               <w:t>5</w:t>
-            </w:r>
-          </w:p>
-        </w:tc>
-        <w:tc>
-          <w:tcPr>
-            <w:tcW w:type="dxa" w:w="864"/>
-          </w:tcPr>
-          <w:p>
-            <w:pPr>
-              <w:jc w:val="left"/>
-            </w:pPr>
-            <w:r/>
-            <w:r>
-              <w:rPr>
-                <w:b w:val="0"/>
-                <w:sz w:val="16"/>
-              </w:rPr>
-              <w:t>13/06</w:t>
-            </w:r>
-          </w:p>
-        </w:tc>
-        <w:tc>
-          <w:tcPr>
-            <w:tcW w:type="dxa" w:w="1296"/>
-          </w:tcPr>
-          <w:p>
-            <w:pPr>
-              <w:jc w:val="left"/>
-            </w:pPr>
-            <w:r/>
-            <w:r>
-              <w:rPr>
-                <w:b w:val="0"/>
-                <w:sz w:val="16"/>
-              </w:rPr>
-              <w:t>Lenin</w:t>
             </w:r>
           </w:p>
         </w:tc>
@@ -785,16 +658,17 @@
             <w:r/>
             <w:r>
               <w:rPr>
+                <w:rFonts w:ascii="Arial" w:hAnsi="Arial"/>
                 <w:b w:val="0"/>
-                <w:sz w:val="16"/>
+                <w:sz w:val="18"/>
               </w:rPr>
-              <w:t>Hacer visible la rotación de cada planeta</w:t>
+              <w:t>Nivel 2 (Galaxia del Khaos)</w:t>
             </w:r>
           </w:p>
         </w:tc>
         <w:tc>
           <w:tcPr>
-            <w:tcW w:type="dxa" w:w="1152"/>
+            <w:tcW w:type="dxa" w:w="3744"/>
           </w:tcPr>
           <w:p>
             <w:pPr>
@@ -803,28 +677,11 @@
             <w:r/>
             <w:r>
               <w:rPr>
+                <w:rFonts w:ascii="Arial" w:hAnsi="Arial"/>
                 <w:b w:val="0"/>
-                <w:sz w:val="16"/>
+                <w:sz w:val="18"/>
               </w:rPr>
-              <w:t>Claude</w:t>
-            </w:r>
-          </w:p>
-        </w:tc>
-        <w:tc>
-          <w:tcPr>
-            <w:tcW w:type="dxa" w:w="2736"/>
-          </w:tcPr>
-          <w:p>
-            <w:pPr>
-              <w:jc w:val="left"/>
-            </w:pPr>
-            <w:r/>
-            <w:r>
-              <w:rPr>
-                <w:b w:val="0"/>
-                <w:sz w:val="16"/>
-              </w:rPr>
-              <w:t>Helper marca() que mueve manchas por el disco</w:t>
+              <w:t>"Diseña un nivel de figuras geometricas con movimiento caotico y una paleta totalmente distinta."</w:t>
             </w:r>
           </w:p>
         </w:tc>
@@ -839,10 +696,30 @@
             <w:r/>
             <w:r>
               <w:rPr>
+                <w:rFonts w:ascii="Arial" w:hAnsi="Arial"/>
                 <w:b w:val="0"/>
-                <w:sz w:val="16"/>
+                <w:sz w:val="18"/>
               </w:rPr>
-              <w:t>Ajustamos para ver solo la cara frontal (cos&gt;0)</w:t>
+              <w:t>Clase FiguraKhaos: poligonos de N lados con rebote y rumbo aleatorio.</w:t>
+            </w:r>
+          </w:p>
+        </w:tc>
+        <w:tc>
+          <w:tcPr>
+            <w:tcW w:type="dxa" w:w="2880"/>
+          </w:tcPr>
+          <w:p>
+            <w:pPr>
+              <w:jc w:val="left"/>
+            </w:pPr>
+            <w:r/>
+            <w:r>
+              <w:rPr>
+                <w:rFonts w:ascii="Arial" w:hAnsi="Arial"/>
+                <w:b w:val="0"/>
+                <w:sz w:val="18"/>
+              </w:rPr>
+              <w:t>Ajustamos a paleta neon para diferenciarlo del Nivel 1.</w:t>
             </w:r>
           </w:p>
         </w:tc>
@@ -854,51 +731,16 @@
           </w:tcPr>
           <w:p>
             <w:pPr>
-              <w:jc w:val="left"/>
+              <w:jc w:val="center"/>
             </w:pPr>
             <w:r/>
             <w:r>
               <w:rPr>
+                <w:rFonts w:ascii="Arial" w:hAnsi="Arial"/>
                 <w:b w:val="0"/>
-                <w:sz w:val="16"/>
+                <w:sz w:val="18"/>
               </w:rPr>
               <w:t>6</w:t>
-            </w:r>
-          </w:p>
-        </w:tc>
-        <w:tc>
-          <w:tcPr>
-            <w:tcW w:type="dxa" w:w="864"/>
-          </w:tcPr>
-          <w:p>
-            <w:pPr>
-              <w:jc w:val="left"/>
-            </w:pPr>
-            <w:r/>
-            <w:r>
-              <w:rPr>
-                <w:b w:val="0"/>
-                <w:sz w:val="16"/>
-              </w:rPr>
-              <w:t>13/06</w:t>
-            </w:r>
-          </w:p>
-        </w:tc>
-        <w:tc>
-          <w:tcPr>
-            <w:tcW w:type="dxa" w:w="1296"/>
-          </w:tcPr>
-          <w:p>
-            <w:pPr>
-              <w:jc w:val="left"/>
-            </w:pPr>
-            <w:r/>
-            <w:r>
-              <w:rPr>
-                <w:b w:val="0"/>
-                <w:sz w:val="16"/>
-              </w:rPr>
-              <w:t>Mustafa</w:t>
             </w:r>
           </w:p>
         </w:tc>
@@ -913,16 +755,17 @@
             <w:r/>
             <w:r>
               <w:rPr>
+                <w:rFonts w:ascii="Arial" w:hAnsi="Arial"/>
                 <w:b w:val="0"/>
-                <w:sz w:val="16"/>
+                <w:sz w:val="18"/>
               </w:rPr>
-              <w:t>Cometas y asteroides aleatorios</w:t>
+              <w:t>Correccion de acentos (codificacion)</w:t>
             </w:r>
           </w:p>
         </w:tc>
         <w:tc>
           <w:tcPr>
-            <w:tcW w:type="dxa" w:w="1152"/>
+            <w:tcW w:type="dxa" w:w="3744"/>
           </w:tcPr>
           <w:p>
             <w:pPr>
@@ -931,28 +774,11 @@
             <w:r/>
             <w:r>
               <w:rPr>
+                <w:rFonts w:ascii="Arial" w:hAnsi="Arial"/>
                 <w:b w:val="0"/>
-                <w:sz w:val="16"/>
+                <w:sz w:val="18"/>
               </w:rPr>
-              <w:t>Claude</w:t>
-            </w:r>
-          </w:p>
-        </w:tc>
-        <w:tc>
-          <w:tcPr>
-            <w:tcW w:type="dxa" w:w="2736"/>
-          </w:tcPr>
-          <w:p>
-            <w:pPr>
-              <w:jc w:val="left"/>
-            </w:pPr>
-            <w:r/>
-            <w:r>
-              <w:rPr>
-                <w:b w:val="0"/>
-                <w:sz w:val="16"/>
-              </w:rPr>
-              <w:t>Cometa (cola) y Asteroide (polígono irregular) + spawner</w:t>
+              <w:t>"Los textos salen como CRÃ‰DITOS en vez de CREDITOS. ¿Por que y como se arregla?"</w:t>
             </w:r>
           </w:p>
         </w:tc>
@@ -967,120 +793,11 @@
             <w:r/>
             <w:r>
               <w:rPr>
+                <w:rFonts w:ascii="Arial" w:hAnsi="Arial"/>
                 <w:b w:val="0"/>
-                <w:sz w:val="16"/>
+                <w:sz w:val="18"/>
               </w:rPr>
-              <w:t>Confirmamos que van más rápido que la nave</w:t>
-            </w:r>
-          </w:p>
-        </w:tc>
-      </w:tr>
-      <w:tr>
-        <w:tc>
-          <w:tcPr>
-            <w:tcW w:type="dxa" w:w="576"/>
-          </w:tcPr>
-          <w:p>
-            <w:pPr>
-              <w:jc w:val="left"/>
-            </w:pPr>
-            <w:r/>
-            <w:r>
-              <w:rPr>
-                <w:b w:val="0"/>
-                <w:sz w:val="16"/>
-              </w:rPr>
-              <w:t>7</w:t>
-            </w:r>
-          </w:p>
-        </w:tc>
-        <w:tc>
-          <w:tcPr>
-            <w:tcW w:type="dxa" w:w="864"/>
-          </w:tcPr>
-          <w:p>
-            <w:pPr>
-              <w:jc w:val="left"/>
-            </w:pPr>
-            <w:r/>
-            <w:r>
-              <w:rPr>
-                <w:b w:val="0"/>
-                <w:sz w:val="16"/>
-              </w:rPr>
-              <w:t>13/06</w:t>
-            </w:r>
-          </w:p>
-        </w:tc>
-        <w:tc>
-          <w:tcPr>
-            <w:tcW w:type="dxa" w:w="1296"/>
-          </w:tcPr>
-          <w:p>
-            <w:pPr>
-              <w:jc w:val="left"/>
-            </w:pPr>
-            <w:r/>
-            <w:r>
-              <w:rPr>
-                <w:b w:val="0"/>
-                <w:sz w:val="16"/>
-              </w:rPr>
-              <w:t>Bryan</w:t>
-            </w:r>
-          </w:p>
-        </w:tc>
-        <w:tc>
-          <w:tcPr>
-            <w:tcW w:type="dxa" w:w="2448"/>
-          </w:tcPr>
-          <w:p>
-            <w:pPr>
-              <w:jc w:val="left"/>
-            </w:pPr>
-            <w:r/>
-            <w:r>
-              <w:rPr>
-                <w:b w:val="0"/>
-                <w:sz w:val="16"/>
-              </w:rPr>
-              <w:t>Colisión → regresar al Punto A + contador</w:t>
-            </w:r>
-          </w:p>
-        </w:tc>
-        <w:tc>
-          <w:tcPr>
-            <w:tcW w:type="dxa" w:w="1152"/>
-          </w:tcPr>
-          <w:p>
-            <w:pPr>
-              <w:jc w:val="left"/>
-            </w:pPr>
-            <w:r/>
-            <w:r>
-              <w:rPr>
-                <w:b w:val="0"/>
-                <w:sz w:val="16"/>
-              </w:rPr>
-              <w:t>Claude</w:t>
-            </w:r>
-          </w:p>
-        </w:tc>
-        <w:tc>
-          <w:tcPr>
-            <w:tcW w:type="dxa" w:w="2736"/>
-          </w:tcPr>
-          <w:p>
-            <w:pPr>
-              <w:jc w:val="left"/>
-            </w:pPr>
-            <w:r/>
-            <w:r>
-              <w:rPr>
-                <w:b w:val="0"/>
-                <w:sz w:val="16"/>
-              </w:rPr>
-              <w:t>revisarColisiones(): resta vida, +1 colisión, reinicia</w:t>
+              <w:t>Agregar la opcion /utf-8 al proyecto en las 4 configuraciones.</w:t>
             </w:r>
           </w:p>
         </w:tc>
@@ -1095,1580 +812,31 @@
             <w:r/>
             <w:r>
               <w:rPr>
+                <w:rFonts w:ascii="Arial" w:hAnsi="Arial"/>
                 <w:b w:val="0"/>
-                <w:sz w:val="16"/>
+                <w:sz w:val="18"/>
               </w:rPr>
-              <w:t>Añadimos 2 s de invulnerabilidad tras reiniciar</w:t>
-            </w:r>
-          </w:p>
-        </w:tc>
-      </w:tr>
-      <w:tr>
-        <w:tc>
-          <w:tcPr>
-            <w:tcW w:type="dxa" w:w="576"/>
-          </w:tcPr>
-          <w:p>
-            <w:pPr>
-              <w:jc w:val="left"/>
-            </w:pPr>
-            <w:r/>
-            <w:r>
-              <w:rPr>
-                <w:b w:val="0"/>
-                <w:sz w:val="16"/>
-              </w:rPr>
-              <w:t>8</w:t>
-            </w:r>
-          </w:p>
-        </w:tc>
-        <w:tc>
-          <w:tcPr>
-            <w:tcW w:type="dxa" w:w="864"/>
-          </w:tcPr>
-          <w:p>
-            <w:pPr>
-              <w:jc w:val="left"/>
-            </w:pPr>
-            <w:r/>
-            <w:r>
-              <w:rPr>
-                <w:b w:val="0"/>
-                <w:sz w:val="16"/>
-              </w:rPr>
-              <w:t>13/06</w:t>
-            </w:r>
-          </w:p>
-        </w:tc>
-        <w:tc>
-          <w:tcPr>
-            <w:tcW w:type="dxa" w:w="1296"/>
-          </w:tcPr>
-          <w:p>
-            <w:pPr>
-              <w:jc w:val="left"/>
-            </w:pPr>
-            <w:r/>
-            <w:r>
-              <w:rPr>
-                <w:b w:val="0"/>
-                <w:sz w:val="16"/>
-              </w:rPr>
-              <w:t>Gustavo</w:t>
-            </w:r>
-          </w:p>
-        </w:tc>
-        <w:tc>
-          <w:tcPr>
-            <w:tcW w:type="dxa" w:w="2448"/>
-          </w:tcPr>
-          <w:p>
-            <w:pPr>
-              <w:jc w:val="left"/>
-            </w:pPr>
-            <w:r/>
-            <w:r>
-              <w:rPr>
-                <w:b w:val="0"/>
-                <w:sz w:val="16"/>
-              </w:rPr>
-              <w:t>Panel de control (tiempo, colisiones, energía, vidas)</w:t>
-            </w:r>
-          </w:p>
-        </w:tc>
-        <w:tc>
-          <w:tcPr>
-            <w:tcW w:type="dxa" w:w="1152"/>
-          </w:tcPr>
-          <w:p>
-            <w:pPr>
-              <w:jc w:val="left"/>
-            </w:pPr>
-            <w:r/>
-            <w:r>
-              <w:rPr>
-                <w:b w:val="0"/>
-                <w:sz w:val="16"/>
-              </w:rPr>
-              <w:t>Claude</w:t>
-            </w:r>
-          </w:p>
-        </w:tc>
-        <w:tc>
-          <w:tcPr>
-            <w:tcW w:type="dxa" w:w="2736"/>
-          </w:tcPr>
-          <w:p>
-            <w:pPr>
-              <w:jc w:val="left"/>
-            </w:pPr>
-            <w:r/>
-            <w:r>
-              <w:rPr>
-                <w:b w:val="0"/>
-                <w:sz w:val="16"/>
-              </w:rPr>
-              <w:t>HUD superior con barra y corazones</w:t>
-            </w:r>
-          </w:p>
-        </w:tc>
-        <w:tc>
-          <w:tcPr>
-            <w:tcW w:type="dxa" w:w="2880"/>
-          </w:tcPr>
-          <w:p>
-            <w:pPr>
-              <w:jc w:val="left"/>
-            </w:pPr>
-            <w:r/>
-            <w:r>
-              <w:rPr>
-                <w:b w:val="0"/>
-                <w:sz w:val="16"/>
-              </w:rPr>
-              <w:t>Verificamos que el tiempo avance en mm:ss</w:t>
-            </w:r>
-          </w:p>
-        </w:tc>
-      </w:tr>
-      <w:tr>
-        <w:tc>
-          <w:tcPr>
-            <w:tcW w:type="dxa" w:w="576"/>
-          </w:tcPr>
-          <w:p>
-            <w:pPr>
-              <w:jc w:val="left"/>
-            </w:pPr>
-            <w:r/>
-            <w:r>
-              <w:rPr>
-                <w:b w:val="0"/>
-                <w:sz w:val="16"/>
-              </w:rPr>
-              <w:t>9</w:t>
-            </w:r>
-          </w:p>
-        </w:tc>
-        <w:tc>
-          <w:tcPr>
-            <w:tcW w:type="dxa" w:w="864"/>
-          </w:tcPr>
-          <w:p>
-            <w:pPr>
-              <w:jc w:val="left"/>
-            </w:pPr>
-            <w:r/>
-            <w:r>
-              <w:rPr>
-                <w:b w:val="0"/>
-                <w:sz w:val="16"/>
-              </w:rPr>
-              <w:t>13/06</w:t>
-            </w:r>
-          </w:p>
-        </w:tc>
-        <w:tc>
-          <w:tcPr>
-            <w:tcW w:type="dxa" w:w="1296"/>
-          </w:tcPr>
-          <w:p>
-            <w:pPr>
-              <w:jc w:val="left"/>
-            </w:pPr>
-            <w:r/>
-            <w:r>
-              <w:rPr>
-                <w:b w:val="0"/>
-                <w:sz w:val="16"/>
-              </w:rPr>
-              <w:t>Gustavo</w:t>
-            </w:r>
-          </w:p>
-        </w:tc>
-        <w:tc>
-          <w:tcPr>
-            <w:tcW w:type="dxa" w:w="2448"/>
-          </w:tcPr>
-          <w:p>
-            <w:pPr>
-              <w:jc w:val="left"/>
-            </w:pPr>
-            <w:r/>
-            <w:r>
-              <w:rPr>
-                <w:b w:val="0"/>
-                <w:sz w:val="16"/>
-              </w:rPr>
-              <w:t>Leyenda de planetas (educativo)</w:t>
-            </w:r>
-          </w:p>
-        </w:tc>
-        <w:tc>
-          <w:tcPr>
-            <w:tcW w:type="dxa" w:w="1152"/>
-          </w:tcPr>
-          <w:p>
-            <w:pPr>
-              <w:jc w:val="left"/>
-            </w:pPr>
-            <w:r/>
-            <w:r>
-              <w:rPr>
-                <w:b w:val="0"/>
-                <w:sz w:val="16"/>
-              </w:rPr>
-              <w:t>Claude</w:t>
-            </w:r>
-          </w:p>
-        </w:tc>
-        <w:tc>
-          <w:tcPr>
-            <w:tcW w:type="dxa" w:w="2736"/>
-          </w:tcPr>
-          <w:p>
-            <w:pPr>
-              <w:jc w:val="left"/>
-            </w:pPr>
-            <w:r/>
-            <w:r>
-              <w:rPr>
-                <w:b w:val="0"/>
-                <w:sz w:val="16"/>
-              </w:rPr>
-              <w:t>Panel lateral con nombres + dato al clic</w:t>
-            </w:r>
-          </w:p>
-        </w:tc>
-        <w:tc>
-          <w:tcPr>
-            <w:tcW w:type="dxa" w:w="2880"/>
-          </w:tcPr>
-          <w:p>
-            <w:pPr>
-              <w:jc w:val="left"/>
-            </w:pPr>
-            <w:r/>
-            <w:r>
-              <w:rPr>
-                <w:b w:val="0"/>
-                <w:sz w:val="16"/>
-              </w:rPr>
-              <w:t>Revisamos que los datos fueran correctos</w:t>
-            </w:r>
-          </w:p>
-        </w:tc>
-      </w:tr>
-      <w:tr>
-        <w:tc>
-          <w:tcPr>
-            <w:tcW w:type="dxa" w:w="576"/>
-          </w:tcPr>
-          <w:p>
-            <w:pPr>
-              <w:jc w:val="left"/>
-            </w:pPr>
-            <w:r/>
-            <w:r>
-              <w:rPr>
-                <w:b w:val="0"/>
-                <w:sz w:val="16"/>
-              </w:rPr>
-              <w:t>10</w:t>
-            </w:r>
-          </w:p>
-        </w:tc>
-        <w:tc>
-          <w:tcPr>
-            <w:tcW w:type="dxa" w:w="864"/>
-          </w:tcPr>
-          <w:p>
-            <w:pPr>
-              <w:jc w:val="left"/>
-            </w:pPr>
-            <w:r/>
-            <w:r>
-              <w:rPr>
-                <w:b w:val="0"/>
-                <w:sz w:val="16"/>
-              </w:rPr>
-              <w:t>13/06</w:t>
-            </w:r>
-          </w:p>
-        </w:tc>
-        <w:tc>
-          <w:tcPr>
-            <w:tcW w:type="dxa" w:w="1296"/>
-          </w:tcPr>
-          <w:p>
-            <w:pPr>
-              <w:jc w:val="left"/>
-            </w:pPr>
-            <w:r/>
-            <w:r>
-              <w:rPr>
-                <w:b w:val="0"/>
-                <w:sz w:val="16"/>
-              </w:rPr>
-              <w:t>Mustafa</w:t>
-            </w:r>
-          </w:p>
-        </w:tc>
-        <w:tc>
-          <w:tcPr>
-            <w:tcW w:type="dxa" w:w="2448"/>
-          </w:tcPr>
-          <w:p>
-            <w:pPr>
-              <w:jc w:val="left"/>
-            </w:pPr>
-            <w:r/>
-            <w:r>
-              <w:rPr>
-                <w:b w:val="0"/>
-                <w:sz w:val="16"/>
-              </w:rPr>
-              <w:t>Nivel 2 caótico (Galaxia del Khaos)</w:t>
-            </w:r>
-          </w:p>
-        </w:tc>
-        <w:tc>
-          <w:tcPr>
-            <w:tcW w:type="dxa" w:w="1152"/>
-          </w:tcPr>
-          <w:p>
-            <w:pPr>
-              <w:jc w:val="left"/>
-            </w:pPr>
-            <w:r/>
-            <w:r>
-              <w:rPr>
-                <w:b w:val="0"/>
-                <w:sz w:val="16"/>
-              </w:rPr>
-              <w:t>Claude</w:t>
-            </w:r>
-          </w:p>
-        </w:tc>
-        <w:tc>
-          <w:tcPr>
-            <w:tcW w:type="dxa" w:w="2736"/>
-          </w:tcPr>
-          <w:p>
-            <w:pPr>
-              <w:jc w:val="left"/>
-            </w:pPr>
-            <w:r/>
-            <w:r>
-              <w:rPr>
-                <w:b w:val="0"/>
-                <w:sz w:val="16"/>
-              </w:rPr>
-              <w:t>FiguraKhaos: polígonos N lados, rebote y rumbo aleatorio</w:t>
-            </w:r>
-          </w:p>
-        </w:tc>
-        <w:tc>
-          <w:tcPr>
-            <w:tcW w:type="dxa" w:w="2880"/>
-          </w:tcPr>
-          <w:p>
-            <w:pPr>
-              <w:jc w:val="left"/>
-            </w:pPr>
-            <w:r/>
-            <w:r>
-              <w:rPr>
-                <w:b w:val="0"/>
-                <w:sz w:val="16"/>
-              </w:rPr>
-              <w:t>Cambiamos a paleta neón para diferenciarlo</w:t>
-            </w:r>
-          </w:p>
-        </w:tc>
-      </w:tr>
-      <w:tr>
-        <w:tc>
-          <w:tcPr>
-            <w:tcW w:type="dxa" w:w="576"/>
-          </w:tcPr>
-          <w:p>
-            <w:pPr>
-              <w:jc w:val="left"/>
-            </w:pPr>
-            <w:r/>
-            <w:r>
-              <w:rPr>
-                <w:b w:val="0"/>
-                <w:sz w:val="16"/>
-              </w:rPr>
-              <w:t>11</w:t>
-            </w:r>
-          </w:p>
-        </w:tc>
-        <w:tc>
-          <w:tcPr>
-            <w:tcW w:type="dxa" w:w="864"/>
-          </w:tcPr>
-          <w:p>
-            <w:pPr>
-              <w:jc w:val="left"/>
-            </w:pPr>
-            <w:r/>
-            <w:r>
-              <w:rPr>
-                <w:b w:val="0"/>
-                <w:sz w:val="16"/>
-              </w:rPr>
-              <w:t>13/06</w:t>
-            </w:r>
-          </w:p>
-        </w:tc>
-        <w:tc>
-          <w:tcPr>
-            <w:tcW w:type="dxa" w:w="1296"/>
-          </w:tcPr>
-          <w:p>
-            <w:pPr>
-              <w:jc w:val="left"/>
-            </w:pPr>
-            <w:r/>
-            <w:r>
-              <w:rPr>
-                <w:b w:val="0"/>
-                <w:sz w:val="16"/>
-              </w:rPr>
-              <w:t>Biary</w:t>
-            </w:r>
-          </w:p>
-        </w:tc>
-        <w:tc>
-          <w:tcPr>
-            <w:tcW w:type="dxa" w:w="2448"/>
-          </w:tcPr>
-          <w:p>
-            <w:pPr>
-              <w:jc w:val="left"/>
-            </w:pPr>
-            <w:r/>
-            <w:r>
-              <w:rPr>
-                <w:b w:val="0"/>
-                <w:sz w:val="16"/>
-              </w:rPr>
-              <w:t>Menú: Niveles, Instrucciones, Creadores, Salir</w:t>
-            </w:r>
-          </w:p>
-        </w:tc>
-        <w:tc>
-          <w:tcPr>
-            <w:tcW w:type="dxa" w:w="1152"/>
-          </w:tcPr>
-          <w:p>
-            <w:pPr>
-              <w:jc w:val="left"/>
-            </w:pPr>
-            <w:r/>
-            <w:r>
-              <w:rPr>
-                <w:b w:val="0"/>
-                <w:sz w:val="16"/>
-              </w:rPr>
-              <w:t>Claude</w:t>
-            </w:r>
-          </w:p>
-        </w:tc>
-        <w:tc>
-          <w:tcPr>
-            <w:tcW w:type="dxa" w:w="2736"/>
-          </w:tcPr>
-          <w:p>
-            <w:pPr>
-              <w:jc w:val="left"/>
-            </w:pPr>
-            <w:r/>
-            <w:r>
-              <w:rPr>
-                <w:b w:val="0"/>
-                <w:sz w:val="16"/>
-              </w:rPr>
-              <w:t>Clase Menu + pantallas</w:t>
-            </w:r>
-          </w:p>
-        </w:tc>
-        <w:tc>
-          <w:tcPr>
-            <w:tcW w:type="dxa" w:w="2880"/>
-          </w:tcPr>
-          <w:p>
-            <w:pPr>
-              <w:jc w:val="left"/>
-            </w:pPr>
-            <w:r/>
-            <w:r>
-              <w:rPr>
-                <w:b w:val="0"/>
-                <w:sz w:val="16"/>
-              </w:rPr>
-              <w:t>Redactamos nosotros el contenido educativo</w:t>
-            </w:r>
-          </w:p>
-        </w:tc>
-      </w:tr>
-      <w:tr>
-        <w:tc>
-          <w:tcPr>
-            <w:tcW w:type="dxa" w:w="576"/>
-          </w:tcPr>
-          <w:p>
-            <w:pPr>
-              <w:jc w:val="left"/>
-            </w:pPr>
-            <w:r/>
-            <w:r>
-              <w:rPr>
-                <w:b w:val="0"/>
-                <w:sz w:val="16"/>
-              </w:rPr>
-              <w:t>12</w:t>
-            </w:r>
-          </w:p>
-        </w:tc>
-        <w:tc>
-          <w:tcPr>
-            <w:tcW w:type="dxa" w:w="864"/>
-          </w:tcPr>
-          <w:p>
-            <w:pPr>
-              <w:jc w:val="left"/>
-            </w:pPr>
-            <w:r/>
-            <w:r>
-              <w:rPr>
-                <w:b w:val="0"/>
-                <w:sz w:val="16"/>
-              </w:rPr>
-              <w:t>13/06</w:t>
-            </w:r>
-          </w:p>
-        </w:tc>
-        <w:tc>
-          <w:tcPr>
-            <w:tcW w:type="dxa" w:w="1296"/>
-          </w:tcPr>
-          <w:p>
-            <w:pPr>
-              <w:jc w:val="left"/>
-            </w:pPr>
-            <w:r/>
-            <w:r>
-              <w:rPr>
-                <w:b w:val="0"/>
-                <w:sz w:val="16"/>
-              </w:rPr>
-              <w:t>Biary</w:t>
-            </w:r>
-          </w:p>
-        </w:tc>
-        <w:tc>
-          <w:tcPr>
-            <w:tcW w:type="dxa" w:w="2448"/>
-          </w:tcPr>
-          <w:p>
-            <w:pPr>
-              <w:jc w:val="left"/>
-            </w:pPr>
-            <w:r/>
-            <w:r>
-              <w:rPr>
-                <w:b w:val="0"/>
-                <w:sz w:val="16"/>
-              </w:rPr>
-              <w:t>Estación (Punto B) y portal (Lugar 2)</w:t>
-            </w:r>
-          </w:p>
-        </w:tc>
-        <w:tc>
-          <w:tcPr>
-            <w:tcW w:type="dxa" w:w="1152"/>
-          </w:tcPr>
-          <w:p>
-            <w:pPr>
-              <w:jc w:val="left"/>
-            </w:pPr>
-            <w:r/>
-            <w:r>
-              <w:rPr>
-                <w:b w:val="0"/>
-                <w:sz w:val="16"/>
-              </w:rPr>
-              <w:t>Claude</w:t>
-            </w:r>
-          </w:p>
-        </w:tc>
-        <w:tc>
-          <w:tcPr>
-            <w:tcW w:type="dxa" w:w="2736"/>
-          </w:tcPr>
-          <w:p>
-            <w:pPr>
-              <w:jc w:val="left"/>
-            </w:pPr>
-            <w:r/>
-            <w:r>
-              <w:rPr>
-                <w:b w:val="0"/>
-                <w:sz w:val="16"/>
-              </w:rPr>
-              <w:t>Estacion con anillo, paneles y luces</w:t>
-            </w:r>
-          </w:p>
-        </w:tc>
-        <w:tc>
-          <w:tcPr>
-            <w:tcW w:type="dxa" w:w="2880"/>
-          </w:tcPr>
-          <w:p>
-            <w:pPr>
-              <w:jc w:val="left"/>
-            </w:pPr>
-            <w:r/>
-            <w:r>
-              <w:rPr>
-                <w:b w:val="0"/>
-                <w:sz w:val="16"/>
-              </w:rPr>
-              <w:t>Ajustamos tamaños y el área de llegada</w:t>
-            </w:r>
-          </w:p>
-        </w:tc>
-      </w:tr>
-      <w:tr>
-        <w:tc>
-          <w:tcPr>
-            <w:tcW w:type="dxa" w:w="576"/>
-          </w:tcPr>
-          <w:p>
-            <w:pPr>
-              <w:jc w:val="left"/>
-            </w:pPr>
-            <w:r/>
-            <w:r>
-              <w:rPr>
-                <w:b w:val="0"/>
-                <w:sz w:val="16"/>
-              </w:rPr>
-              <w:t>13</w:t>
-            </w:r>
-          </w:p>
-        </w:tc>
-        <w:tc>
-          <w:tcPr>
-            <w:tcW w:type="dxa" w:w="864"/>
-          </w:tcPr>
-          <w:p>
-            <w:pPr>
-              <w:jc w:val="left"/>
-            </w:pPr>
-            <w:r/>
-            <w:r>
-              <w:rPr>
-                <w:b w:val="0"/>
-                <w:sz w:val="16"/>
-              </w:rPr>
-              <w:t>13/06</w:t>
-            </w:r>
-          </w:p>
-        </w:tc>
-        <w:tc>
-          <w:tcPr>
-            <w:tcW w:type="dxa" w:w="1296"/>
-          </w:tcPr>
-          <w:p>
-            <w:pPr>
-              <w:jc w:val="left"/>
-            </w:pPr>
-            <w:r/>
-            <w:r>
-              <w:rPr>
-                <w:b w:val="0"/>
-                <w:sz w:val="16"/>
-              </w:rPr>
-              <w:t>Bryan</w:t>
-            </w:r>
-          </w:p>
-        </w:tc>
-        <w:tc>
-          <w:tcPr>
-            <w:tcW w:type="dxa" w:w="2448"/>
-          </w:tcPr>
-          <w:p>
-            <w:pPr>
-              <w:jc w:val="left"/>
-            </w:pPr>
-            <w:r/>
-            <w:r>
-              <w:rPr>
-                <w:b w:val="0"/>
-                <w:sz w:val="16"/>
-              </w:rPr>
-              <w:t>Mensajes de éxito y derrota</w:t>
-            </w:r>
-          </w:p>
-        </w:tc>
-        <w:tc>
-          <w:tcPr>
-            <w:tcW w:type="dxa" w:w="1152"/>
-          </w:tcPr>
-          <w:p>
-            <w:pPr>
-              <w:jc w:val="left"/>
-            </w:pPr>
-            <w:r/>
-            <w:r>
-              <w:rPr>
-                <w:b w:val="0"/>
-                <w:sz w:val="16"/>
-              </w:rPr>
-              <w:t>Claude</w:t>
-            </w:r>
-          </w:p>
-        </w:tc>
-        <w:tc>
-          <w:tcPr>
-            <w:tcW w:type="dxa" w:w="2736"/>
-          </w:tcPr>
-          <w:p>
-            <w:pPr>
-              <w:jc w:val="left"/>
-            </w:pPr>
-            <w:r/>
-            <w:r>
-              <w:rPr>
-                <w:b w:val="0"/>
-                <w:sz w:val="16"/>
-              </w:rPr>
-              <w:t>'NIVEL 1 COMPLETO…' y 'MISIÓN CUMPLIDA…'</w:t>
-            </w:r>
-          </w:p>
-        </w:tc>
-        <w:tc>
-          <w:tcPr>
-            <w:tcW w:type="dxa" w:w="2880"/>
-          </w:tcPr>
-          <w:p>
-            <w:pPr>
-              <w:jc w:val="left"/>
-            </w:pPr>
-            <w:r/>
-            <w:r>
-              <w:rPr>
-                <w:b w:val="0"/>
-                <w:sz w:val="16"/>
-              </w:rPr>
-              <w:t>Verificamos los textos que pide la rúbrica</w:t>
-            </w:r>
-          </w:p>
-        </w:tc>
-      </w:tr>
-      <w:tr>
-        <w:tc>
-          <w:tcPr>
-            <w:tcW w:type="dxa" w:w="576"/>
-          </w:tcPr>
-          <w:p>
-            <w:pPr>
-              <w:jc w:val="left"/>
-            </w:pPr>
-            <w:r/>
-            <w:r>
-              <w:rPr>
-                <w:b w:val="0"/>
-                <w:sz w:val="16"/>
-              </w:rPr>
-              <w:t>14</w:t>
-            </w:r>
-          </w:p>
-        </w:tc>
-        <w:tc>
-          <w:tcPr>
-            <w:tcW w:type="dxa" w:w="864"/>
-          </w:tcPr>
-          <w:p>
-            <w:pPr>
-              <w:jc w:val="left"/>
-            </w:pPr>
-            <w:r/>
-            <w:r>
-              <w:rPr>
-                <w:b w:val="0"/>
-                <w:sz w:val="16"/>
-              </w:rPr>
-              <w:t>13/06</w:t>
-            </w:r>
-          </w:p>
-        </w:tc>
-        <w:tc>
-          <w:tcPr>
-            <w:tcW w:type="dxa" w:w="1296"/>
-          </w:tcPr>
-          <w:p>
-            <w:pPr>
-              <w:jc w:val="left"/>
-            </w:pPr>
-            <w:r/>
-            <w:r>
-              <w:rPr>
-                <w:b w:val="0"/>
-                <w:sz w:val="16"/>
-              </w:rPr>
-              <w:t>Mustafa</w:t>
-            </w:r>
-          </w:p>
-        </w:tc>
-        <w:tc>
-          <w:tcPr>
-            <w:tcW w:type="dxa" w:w="2448"/>
-          </w:tcPr>
-          <w:p>
-            <w:pPr>
-              <w:jc w:val="left"/>
-            </w:pPr>
-            <w:r/>
-            <w:r>
-              <w:rPr>
-                <w:b w:val="0"/>
-                <w:sz w:val="16"/>
-              </w:rPr>
-              <w:t>Sonido sin archivos (tonos) en hilo aparte</w:t>
-            </w:r>
-          </w:p>
-        </w:tc>
-        <w:tc>
-          <w:tcPr>
-            <w:tcW w:type="dxa" w:w="1152"/>
-          </w:tcPr>
-          <w:p>
-            <w:pPr>
-              <w:jc w:val="left"/>
-            </w:pPr>
-            <w:r/>
-            <w:r>
-              <w:rPr>
-                <w:b w:val="0"/>
-                <w:sz w:val="16"/>
-              </w:rPr>
-              <w:t>Claude</w:t>
-            </w:r>
-          </w:p>
-        </w:tc>
-        <w:tc>
-          <w:tcPr>
-            <w:tcW w:type="dxa" w:w="2736"/>
-          </w:tcPr>
-          <w:p>
-            <w:pPr>
-              <w:jc w:val="left"/>
-            </w:pPr>
-            <w:r/>
-            <w:r>
-              <w:rPr>
-                <w:b w:val="0"/>
-                <w:sz w:val="16"/>
-              </w:rPr>
-              <w:t>Sonido con Console::Beep en ThreadPool</w:t>
-            </w:r>
-          </w:p>
-        </w:tc>
-        <w:tc>
-          <w:tcPr>
-            <w:tcW w:type="dxa" w:w="2880"/>
-          </w:tcPr>
-          <w:p>
-            <w:pPr>
-              <w:jc w:val="left"/>
-            </w:pPr>
-            <w:r/>
-            <w:r>
-              <w:rPr>
-                <w:b w:val="0"/>
-                <w:sz w:val="16"/>
-              </w:rPr>
-              <w:t>Comprobamos que el juego no se congela</w:t>
-            </w:r>
-          </w:p>
-        </w:tc>
-      </w:tr>
-      <w:tr>
-        <w:tc>
-          <w:tcPr>
-            <w:tcW w:type="dxa" w:w="576"/>
-          </w:tcPr>
-          <w:p>
-            <w:pPr>
-              <w:jc w:val="left"/>
-            </w:pPr>
-            <w:r/>
-            <w:r>
-              <w:rPr>
-                <w:b w:val="0"/>
-                <w:sz w:val="16"/>
-              </w:rPr>
-              <w:t>15</w:t>
-            </w:r>
-          </w:p>
-        </w:tc>
-        <w:tc>
-          <w:tcPr>
-            <w:tcW w:type="dxa" w:w="864"/>
-          </w:tcPr>
-          <w:p>
-            <w:pPr>
-              <w:jc w:val="left"/>
-            </w:pPr>
-            <w:r/>
-            <w:r>
-              <w:rPr>
-                <w:b w:val="0"/>
-                <w:sz w:val="16"/>
-              </w:rPr>
-              <w:t>13/06</w:t>
-            </w:r>
-          </w:p>
-        </w:tc>
-        <w:tc>
-          <w:tcPr>
-            <w:tcW w:type="dxa" w:w="1296"/>
-          </w:tcPr>
-          <w:p>
-            <w:pPr>
-              <w:jc w:val="left"/>
-            </w:pPr>
-            <w:r/>
-            <w:r>
-              <w:rPr>
-                <w:b w:val="0"/>
-                <w:sz w:val="16"/>
-              </w:rPr>
-              <w:t>Gustavo</w:t>
-            </w:r>
-          </w:p>
-        </w:tc>
-        <w:tc>
-          <w:tcPr>
-            <w:tcW w:type="dxa" w:w="2448"/>
-          </w:tcPr>
-          <w:p>
-            <w:pPr>
-              <w:jc w:val="left"/>
-            </w:pPr>
-            <w:r/>
-            <w:r>
-              <w:rPr>
-                <w:b w:val="0"/>
-                <w:sz w:val="16"/>
-              </w:rPr>
-              <w:t>Imagen de fondo decorativa (permitida)</w:t>
-            </w:r>
-          </w:p>
-        </w:tc>
-        <w:tc>
-          <w:tcPr>
-            <w:tcW w:type="dxa" w:w="1152"/>
-          </w:tcPr>
-          <w:p>
-            <w:pPr>
-              <w:jc w:val="left"/>
-            </w:pPr>
-            <w:r/>
-            <w:r>
-              <w:rPr>
-                <w:b w:val="0"/>
-                <w:sz w:val="16"/>
-              </w:rPr>
-              <w:t>Claude</w:t>
-            </w:r>
-          </w:p>
-        </w:tc>
-        <w:tc>
-          <w:tcPr>
-            <w:tcW w:type="dxa" w:w="2736"/>
-          </w:tcPr>
-          <w:p>
-            <w:pPr>
-              <w:jc w:val="left"/>
-            </w:pPr>
-            <w:r/>
-            <w:r>
-              <w:rPr>
-                <w:b w:val="0"/>
-                <w:sz w:val="16"/>
-              </w:rPr>
-              <w:t>Recursos carga espacio.png/menu.png con respaldo</w:t>
-            </w:r>
-          </w:p>
-        </w:tc>
-        <w:tc>
-          <w:tcPr>
-            <w:tcW w:type="dxa" w:w="2880"/>
-          </w:tcPr>
-          <w:p>
-            <w:pPr>
-              <w:jc w:val="left"/>
-            </w:pPr>
-            <w:r/>
-            <w:r>
-              <w:rPr>
-                <w:b w:val="0"/>
-                <w:sz w:val="16"/>
-              </w:rPr>
-              <w:t>Si falta la imagen, no se cae el programa</w:t>
-            </w:r>
-          </w:p>
-        </w:tc>
-      </w:tr>
-      <w:tr>
-        <w:tc>
-          <w:tcPr>
-            <w:tcW w:type="dxa" w:w="576"/>
-          </w:tcPr>
-          <w:p>
-            <w:pPr>
-              <w:jc w:val="left"/>
-            </w:pPr>
-            <w:r/>
-            <w:r>
-              <w:rPr>
-                <w:b w:val="0"/>
-                <w:sz w:val="16"/>
-              </w:rPr>
-              <w:t>16</w:t>
-            </w:r>
-          </w:p>
-        </w:tc>
-        <w:tc>
-          <w:tcPr>
-            <w:tcW w:type="dxa" w:w="864"/>
-          </w:tcPr>
-          <w:p>
-            <w:pPr>
-              <w:jc w:val="left"/>
-            </w:pPr>
-            <w:r/>
-            <w:r>
-              <w:rPr>
-                <w:b w:val="0"/>
-                <w:sz w:val="16"/>
-              </w:rPr>
-              <w:t>13/06</w:t>
-            </w:r>
-          </w:p>
-        </w:tc>
-        <w:tc>
-          <w:tcPr>
-            <w:tcW w:type="dxa" w:w="1296"/>
-          </w:tcPr>
-          <w:p>
-            <w:pPr>
-              <w:jc w:val="left"/>
-            </w:pPr>
-            <w:r/>
-            <w:r>
-              <w:rPr>
-                <w:b w:val="0"/>
-                <w:sz w:val="16"/>
-              </w:rPr>
-              <w:t>Lenin</w:t>
-            </w:r>
-          </w:p>
-        </w:tc>
-        <w:tc>
-          <w:tcPr>
-            <w:tcW w:type="dxa" w:w="2448"/>
-          </w:tcPr>
-          <w:p>
-            <w:pPr>
-              <w:jc w:val="left"/>
-            </w:pPr>
-            <w:r/>
-            <w:r>
-              <w:rPr>
-                <w:b w:val="0"/>
-                <w:sz w:val="16"/>
-              </w:rPr>
-              <w:t>Corregir acentos que salían como 'Ã©'</w:t>
-            </w:r>
-          </w:p>
-        </w:tc>
-        <w:tc>
-          <w:tcPr>
-            <w:tcW w:type="dxa" w:w="1152"/>
-          </w:tcPr>
-          <w:p>
-            <w:pPr>
-              <w:jc w:val="left"/>
-            </w:pPr>
-            <w:r/>
-            <w:r>
-              <w:rPr>
-                <w:b w:val="0"/>
-                <w:sz w:val="16"/>
-              </w:rPr>
-              <w:t>Claude</w:t>
-            </w:r>
-          </w:p>
-        </w:tc>
-        <w:tc>
-          <w:tcPr>
-            <w:tcW w:type="dxa" w:w="2736"/>
-          </w:tcPr>
-          <w:p>
-            <w:pPr>
-              <w:jc w:val="left"/>
-            </w:pPr>
-            <w:r/>
-            <w:r>
-              <w:rPr>
-                <w:b w:val="0"/>
-                <w:sz w:val="16"/>
-              </w:rPr>
-              <w:t>Agregar /utf-8 al proyecto</w:t>
-            </w:r>
-          </w:p>
-        </w:tc>
-        <w:tc>
-          <w:tcPr>
-            <w:tcW w:type="dxa" w:w="2880"/>
-          </w:tcPr>
-          <w:p>
-            <w:pPr>
-              <w:jc w:val="left"/>
-            </w:pPr>
-            <w:r/>
-            <w:r>
-              <w:rPr>
-                <w:b w:val="0"/>
-                <w:sz w:val="16"/>
-              </w:rPr>
-              <w:t>Recompilamos y verificamos CRÉDITOS, MISIÓN, etc.</w:t>
-            </w:r>
-          </w:p>
-        </w:tc>
-      </w:tr>
-      <w:tr>
-        <w:tc>
-          <w:tcPr>
-            <w:tcW w:type="dxa" w:w="576"/>
-          </w:tcPr>
-          <w:p>
-            <w:pPr>
-              <w:jc w:val="left"/>
-            </w:pPr>
-            <w:r/>
-            <w:r>
-              <w:rPr>
-                <w:b w:val="0"/>
-                <w:sz w:val="16"/>
-              </w:rPr>
-              <w:t>17</w:t>
-            </w:r>
-          </w:p>
-        </w:tc>
-        <w:tc>
-          <w:tcPr>
-            <w:tcW w:type="dxa" w:w="864"/>
-          </w:tcPr>
-          <w:p>
-            <w:pPr>
-              <w:jc w:val="left"/>
-            </w:pPr>
-            <w:r/>
-            <w:r>
-              <w:rPr>
-                <w:b w:val="0"/>
-                <w:sz w:val="16"/>
-              </w:rPr>
-              <w:t>14/06</w:t>
-            </w:r>
-          </w:p>
-        </w:tc>
-        <w:tc>
-          <w:tcPr>
-            <w:tcW w:type="dxa" w:w="1296"/>
-          </w:tcPr>
-          <w:p>
-            <w:pPr>
-              <w:jc w:val="left"/>
-            </w:pPr>
-            <w:r/>
-            <w:r>
-              <w:rPr>
-                <w:b w:val="0"/>
-                <w:sz w:val="16"/>
-              </w:rPr>
-              <w:t>Bryan</w:t>
-            </w:r>
-          </w:p>
-        </w:tc>
-        <w:tc>
-          <w:tcPr>
-            <w:tcW w:type="dxa" w:w="2448"/>
-          </w:tcPr>
-          <w:p>
-            <w:pPr>
-              <w:jc w:val="left"/>
-            </w:pPr>
-            <w:r/>
-            <w:r>
-              <w:rPr>
-                <w:b w:val="0"/>
-                <w:sz w:val="16"/>
-              </w:rPr>
-              <w:t>Diagrama UML de clases</w:t>
-            </w:r>
-          </w:p>
-        </w:tc>
-        <w:tc>
-          <w:tcPr>
-            <w:tcW w:type="dxa" w:w="1152"/>
-          </w:tcPr>
-          <w:p>
-            <w:pPr>
-              <w:jc w:val="left"/>
-            </w:pPr>
-            <w:r/>
-            <w:r>
-              <w:rPr>
-                <w:b w:val="0"/>
-                <w:sz w:val="16"/>
-              </w:rPr>
-              <w:t>Claude</w:t>
-            </w:r>
-          </w:p>
-        </w:tc>
-        <w:tc>
-          <w:tcPr>
-            <w:tcW w:type="dxa" w:w="2736"/>
-          </w:tcPr>
-          <w:p>
-            <w:pPr>
-              <w:jc w:val="left"/>
-            </w:pPr>
-            <w:r/>
-            <w:r>
-              <w:rPr>
-                <w:b w:val="0"/>
-                <w:sz w:val="16"/>
-              </w:rPr>
-              <w:t>UML (PlantUML + imagen PNG)</w:t>
-            </w:r>
-          </w:p>
-        </w:tc>
-        <w:tc>
-          <w:tcPr>
-            <w:tcW w:type="dxa" w:w="2880"/>
-          </w:tcPr>
-          <w:p>
-            <w:pPr>
-              <w:jc w:val="left"/>
-            </w:pPr>
-            <w:r/>
-            <w:r>
-              <w:rPr>
-                <w:b w:val="0"/>
-                <w:sz w:val="16"/>
-              </w:rPr>
-              <w:t>Lo contrastamos con el código clase por clase</w:t>
-            </w:r>
-          </w:p>
-        </w:tc>
-      </w:tr>
-      <w:tr>
-        <w:tc>
-          <w:tcPr>
-            <w:tcW w:type="dxa" w:w="576"/>
-          </w:tcPr>
-          <w:p>
-            <w:pPr>
-              <w:jc w:val="left"/>
-            </w:pPr>
-            <w:r/>
-            <w:r>
-              <w:rPr>
-                <w:b w:val="0"/>
-                <w:sz w:val="16"/>
-              </w:rPr>
-              <w:t>18</w:t>
-            </w:r>
-          </w:p>
-        </w:tc>
-        <w:tc>
-          <w:tcPr>
-            <w:tcW w:type="dxa" w:w="864"/>
-          </w:tcPr>
-          <w:p>
-            <w:pPr>
-              <w:jc w:val="left"/>
-            </w:pPr>
-            <w:r/>
-            <w:r>
-              <w:rPr>
-                <w:b w:val="0"/>
-                <w:sz w:val="16"/>
-              </w:rPr>
-              <w:t>14/06</w:t>
-            </w:r>
-          </w:p>
-        </w:tc>
-        <w:tc>
-          <w:tcPr>
-            <w:tcW w:type="dxa" w:w="1296"/>
-          </w:tcPr>
-          <w:p>
-            <w:pPr>
-              <w:jc w:val="left"/>
-            </w:pPr>
-            <w:r/>
-            <w:r>
-              <w:rPr>
-                <w:b w:val="0"/>
-                <w:sz w:val="16"/>
-              </w:rPr>
-              <w:t>Todos</w:t>
-            </w:r>
-          </w:p>
-        </w:tc>
-        <w:tc>
-          <w:tcPr>
-            <w:tcW w:type="dxa" w:w="2448"/>
-          </w:tcPr>
-          <w:p>
-            <w:pPr>
-              <w:jc w:val="left"/>
-            </w:pPr>
-            <w:r/>
-            <w:r>
-              <w:rPr>
-                <w:b w:val="0"/>
-                <w:sz w:val="16"/>
-              </w:rPr>
-              <w:t>Pruebas integrales y ajuste de dificultad</w:t>
-            </w:r>
-          </w:p>
-        </w:tc>
-        <w:tc>
-          <w:tcPr>
-            <w:tcW w:type="dxa" w:w="1152"/>
-          </w:tcPr>
-          <w:p>
-            <w:pPr>
-              <w:jc w:val="left"/>
-            </w:pPr>
-            <w:r/>
-            <w:r>
-              <w:rPr>
-                <w:b w:val="0"/>
-                <w:sz w:val="16"/>
-              </w:rPr>
-              <w:t>Claude</w:t>
-            </w:r>
-          </w:p>
-        </w:tc>
-        <w:tc>
-          <w:tcPr>
-            <w:tcW w:type="dxa" w:w="2736"/>
-          </w:tcPr>
-          <w:p>
-            <w:pPr>
-              <w:jc w:val="left"/>
-            </w:pPr>
-            <w:r/>
-            <w:r>
-              <w:rPr>
-                <w:b w:val="0"/>
-                <w:sz w:val="16"/>
-              </w:rPr>
-              <w:t>Velocidades de spawn y tamaños equilibrados</w:t>
-            </w:r>
-          </w:p>
-        </w:tc>
-        <w:tc>
-          <w:tcPr>
-            <w:tcW w:type="dxa" w:w="2880"/>
-          </w:tcPr>
-          <w:p>
-            <w:pPr>
-              <w:jc w:val="left"/>
-            </w:pPr>
-            <w:r/>
-            <w:r>
-              <w:rPr>
-                <w:b w:val="0"/>
-                <w:sz w:val="16"/>
-              </w:rPr>
-              <w:t>Jugamos ambos niveles sin errores</w:t>
+              <w:t>Recompilamos y verificamos que los acentos salieran bien.</w:t>
             </w:r>
           </w:p>
         </w:tc>
       </w:tr>
     </w:tbl>
-    <w:p>
-      <w:pPr>
-        <w:pStyle w:val="Heading1"/>
-      </w:pPr>
-      <w:r>
-        <w:t>2. Detalle de prompts representativos</w:t>
-      </w:r>
-    </w:p>
+    <w:p/>
     <w:p>
       <w:r>
         <w:rPr>
           <w:b/>
         </w:rPr>
-        <w:t>Prompt (act. 1 — jerarquía POO):</w:t>
-      </w:r>
-    </w:p>
-    <w:p>
-      <w:pPr>
-        <w:pStyle w:val="Quote"/>
-      </w:pPr>
-      <w:r>
-        <w:t>"Según esta rúbrica necesitamos un juego en C++/CLI donde una nave va del Punto A al Punto B esquivando cometas y asteroides, con planetas que rotan y orbitan. Propón una jerarquía de clases con una clase base abstracta y herencia, en español."</w:t>
-      </w:r>
-    </w:p>
-    <w:p>
-      <w:r>
-        <w:rPr>
-          <w:b/>
-        </w:rPr>
-        <w:t xml:space="preserve">Resultado: </w:t>
+        <w:t xml:space="preserve">Reflexion del equipo: </w:t>
       </w:r>
       <w:r>
-        <w:t>propuso Entidad (abstracta con x,y,dx,dy y métodos virtuales puros) y de ahí Nave, Sol, Planeta, Obstaculo y Estacion.</w:t>
-      </w:r>
-    </w:p>
-    <w:p>
-      <w:r>
-        <w:rPr>
-          <w:b/>
-        </w:rPr>
-        <w:t xml:space="preserve">Qué hicimos nosotros: </w:t>
-      </w:r>
-      <w:r>
-        <w:t>validamos que Planeta y Obstaculo también fueran abstractas (polimorfismo) y renombramos métodos al español.</w:t>
-      </w:r>
-    </w:p>
-    <w:p>
-      <w:r>
-        <w:rPr>
-          <w:b/>
-        </w:rPr>
-        <w:t>Prompt (act. 5 — rotación visible):</w:t>
-      </w:r>
-    </w:p>
-    <w:p>
-      <w:pPr>
-        <w:pStyle w:val="Quote"/>
-      </w:pPr>
-      <w:r>
-        <w:t>"La rotación de los planetas no se nota. ¿Cómo hago que se vea girar usando solo figuras, sin sprites?"</w:t>
-      </w:r>
-    </w:p>
-    <w:p>
-      <w:r>
-        <w:rPr>
-          <w:b/>
-        </w:rPr>
-        <w:t xml:space="preserve">Resultado: </w:t>
-      </w:r>
-      <w:r>
-        <w:t>el helper marca() ubica manchas según una 'longitud' y un ángulo rot; al aumentar rot las manchas cruzan el disco y solo se ven las del frente (cos(ang)&gt;0).</w:t>
-      </w:r>
-    </w:p>
-    <w:p>
-      <w:r>
-        <w:rPr>
-          <w:b/>
-        </w:rPr>
-        <w:t xml:space="preserve">Qué hicimos nosotros: </w:t>
-      </w:r>
-      <w:r>
-        <w:t>probamos valores hasta que el giro se viera fluido.</w:t>
-      </w:r>
-    </w:p>
-    <w:p>
-      <w:r>
-        <w:rPr>
-          <w:b/>
-        </w:rPr>
-        <w:t>Prompt (act. 16 — acentos):</w:t>
-      </w:r>
-    </w:p>
-    <w:p>
-      <w:pPr>
-        <w:pStyle w:val="Quote"/>
-      </w:pPr>
-      <w:r>
-        <w:t>"Los textos salen como CRÃ‰DITOS en vez de CRÉDITOS. ¿Por qué y cómo se arregla?"</w:t>
-      </w:r>
-    </w:p>
-    <w:p>
-      <w:r>
-        <w:rPr>
-          <w:b/>
-        </w:rPr>
-        <w:t xml:space="preserve">Resultado: </w:t>
-      </w:r>
-      <w:r>
-        <w:t>el compilador leía el archivo como ANSI; la solución fue añadir la opción /utf-8.</w:t>
-      </w:r>
-    </w:p>
-    <w:p>
-      <w:r>
-        <w:rPr>
-          <w:b/>
-        </w:rPr>
-        <w:t xml:space="preserve">Qué hicimos nosotros: </w:t>
-      </w:r>
-      <w:r>
-        <w:t>lo aplicamos en Propiedades → C/C++ → Línea de comandos en las 4 configuraciones y recompilamos.</w:t>
-      </w:r>
-    </w:p>
-    <w:p>
-      <w:pPr>
-        <w:pStyle w:val="Heading1"/>
-      </w:pPr>
-      <w:r>
-        <w:t>3. Reflexión del equipo</w:t>
-      </w:r>
-    </w:p>
-    <w:p>
-      <w:pPr>
-        <w:pStyle w:val="ListBullet"/>
-      </w:pPr>
-      <w:r>
-        <w:t>La IA aceleró el diseño y el dibujo con figuras, pero las decisiones de diseño, la dificultad, los textos educativos y las pruebas las hicimos nosotros.</w:t>
-      </w:r>
-    </w:p>
-    <w:p>
-      <w:pPr>
-        <w:pStyle w:val="ListBullet"/>
-      </w:pPr>
-      <w:r>
-        <w:t>Entendemos cada clase: qué hereda, qué método es virtual y por qué, cómo la clase controladora Juego integra todo, y cómo funcionan la traslación (seno/coseno) y la rotación.</w:t>
-      </w:r>
-    </w:p>
-    <w:p>
-      <w:pPr>
-        <w:pStyle w:val="ListBullet"/>
-      </w:pPr>
-      <w:r>
-        <w:t>Usamos la IA de forma reflexiva: cuando una respuesta no encajaba con la rúbrica (por ejemplo, usar sprites de planetas), la descartamos y dibujamos todo con figuras.</w:t>
+        <w:t>la IA acelero el diseño y el dibujo con figuras, pero las decisiones, la dificultad, los textos y las pruebas las hicimos nosotros. Cuando una respuesta no cumplia la rubrica (por ejemplo, usar sprites de planetas), la descartamos y dibujamos todo con figuras.</w:t>
       </w:r>
     </w:p>
     <w:sectPr>
       <w:pgSz w:w="12240" w:h="15840"/>
-      <w:pgMar w:top="1440" w:right="864" w:bottom="1440" w:left="864" w:header="720" w:footer="720" w:gutter="0"/>
+      <w:pgMar w:top="1008" w:right="1008" w:bottom="1440" w:left="1008" w:header="720" w:footer="720" w:gutter="0"/>
       <w:cols w:space="720"/>
       <w:docGrid w:linePitch="360"/>
     </w:sectPr>
@@ -3039,6 +1207,10 @@
     <w:name w:val="Normal"/>
     <w:qFormat/>
     <w:rsid w:val="00FC693F"/>
+    <w:rPr>
+      <w:rFonts w:ascii="Arial" w:hAnsi="Arial" w:cs="Arial"/>
+      <w:sz w:val="22"/>
+    </w:rPr>
   </w:style>
   <w:style w:type="paragraph" w:styleId="Header">
     <w:name w:val="header"/>

</xml_diff>